<commit_message>
6th step in process
</commit_message>
<xml_diff>
--- a/docs/Project_Brief.docx
+++ b/docs/Project_Brief.docx
@@ -1003,10 +1003,38 @@
                 <w:b/>
                 <w:bCs/>
               </w:rPr>
-              <w:t>Fairness:</w:t>
-            </w:r>
-            <w:r>
-              <w:t xml:space="preserve"> The model will be less reliable for teams with sparse match history (bias against newer/under-represented teams) and does not capture recent roster changes, since player-level stats are static and excluded. These limitations are disclosed via a confidence flag rather than hidden; the tool is intended as decision support, not a final authority for seeding disputes.</w:t>
+              <w:t xml:space="preserve">Fairness: </w:t>
+            </w:r>
+            <w:r>
+              <w:t>Empirical testing (05_</w:t>
+            </w:r>
+            <w:proofErr w:type="gramStart"/>
+            <w:r>
+              <w:t>evaluation.ipynb</w:t>
+            </w:r>
+            <w:proofErr w:type="gramEnd"/>
+            <w:r>
+              <w:t xml:space="preserve">) did not confirm the originally hypothesized bias — sparse-history matches (&lt;10 games, n=223) showed </w:t>
+            </w:r>
+            <w:r>
+              <w:rPr>
+                <w:i/>
+                <w:iCs/>
+              </w:rPr>
+              <w:t>higher</w:t>
+            </w:r>
+            <w:r>
+              <w:t xml:space="preserve"> observed accuracy (93.3%) than established matchups (≥10 games, n=1176, 72.6%), likely because sparse-history teams often face clear skill mismatches. However, sparse-history </w:t>
+            </w:r>
+            <w:r>
+              <w:rPr>
+                <w:i/>
+                <w:iCs/>
+              </w:rPr>
+              <w:t>feature/Elo estimates</w:t>
+            </w:r>
+            <w:r>
+              <w:t xml:space="preserve"> remain statistically less grounded due to fewer observations, so a confidence flag is still surfaced for transparency. The model does not capture recent roster changes. These limitations are disclosed; the tool is intended as decision support, not a final authority for seeding disputes.</w:t>
             </w:r>
           </w:p>
         </w:tc>
@@ -1105,6 +1133,7 @@
                 <w:color w:val="183153"/>
                 <w:sz w:val="18"/>
               </w:rPr>
+              <w:lastRenderedPageBreak/>
               <w:t>ML problem formulation</w:t>
             </w:r>
           </w:p>
@@ -1175,11 +1204,7 @@
           </w:tcPr>
           <w:p>
             <w:r>
-              <w:t xml:space="preserve">A simple Elo rating system, computed strictly from (date, </w:t>
-            </w:r>
-            <w:r>
-              <w:lastRenderedPageBreak/>
-              <w:t>team1_name, team2_name, winner) in chronological order, used to derive a baseline win-probability estimate (and compared against a naive 50/50 baseline).</w:t>
+              <w:t>A simple Elo rating system, computed strictly from (date, team1_name, team2_name, winner) in chronological order, used to derive a baseline win-probability estimate (and compared against a naive 50/50 baseline).</w:t>
             </w:r>
           </w:p>
         </w:tc>
@@ -1207,7 +1232,6 @@
                 <w:color w:val="183153"/>
                 <w:sz w:val="18"/>
               </w:rPr>
-              <w:lastRenderedPageBreak/>
               <w:t>Main modeling approach(es) to investigate</w:t>
             </w:r>
           </w:p>
@@ -1589,20 +1613,30 @@
               <w:spacing w:after="80"/>
             </w:pPr>
             <w:r>
-              <w:t xml:space="preserve">Predicted probabilities may not be well-calibrated (e.g. a "70%" prediction may not correspond to a true 70% empirical win rate); calibration will be checked (e.g. reliability diagram, Brier score) before relying on raw probabilities for seeding. </w:t>
-            </w:r>
-          </w:p>
-          <w:p>
-            <w:pPr>
-              <w:pStyle w:val="ae"/>
-              <w:numPr>
-                <w:ilvl w:val="0"/>
-                <w:numId w:val="10"/>
-              </w:numPr>
-              <w:spacing w:after="80"/>
-            </w:pPr>
-            <w:r>
-              <w:t xml:space="preserve">Model behavior on teams with sparse or zero match history has not yet been empirically validated; this will be explicitly tested rather than only assumed as a limitation. </w:t>
+              <w:rPr>
+                <w:b/>
+                <w:bCs/>
+              </w:rPr>
+              <w:t>[Tested, 05_</w:t>
+            </w:r>
+            <w:proofErr w:type="gramStart"/>
+            <w:r>
+              <w:rPr>
+                <w:b/>
+                <w:bCs/>
+              </w:rPr>
+              <w:t>evaluation.ipynb</w:t>
+            </w:r>
+            <w:proofErr w:type="gramEnd"/>
+            <w:r>
+              <w:rPr>
+                <w:b/>
+                <w:bCs/>
+              </w:rPr>
+              <w:t>]</w:t>
+            </w:r>
+            <w:r>
+              <w:t xml:space="preserve"> Calibration: Brier score 0.1612; confidence-bucket accuracy rises monotonically from 57.8% (0–20% confidence) to 96.6% (80–100% confidence), indicating reasonably well-calibrated probabilities.</w:t>
             </w:r>
           </w:p>
           <w:p>
@@ -1616,23 +1650,14 @@
               <w:contextualSpacing w:val="0"/>
             </w:pPr>
             <w:r>
-              <w:t xml:space="preserve">Prediction symmetry is not guaranteed by construction: </w:t>
-            </w:r>
-            <w:proofErr w:type="gramStart"/>
-            <w:r>
-              <w:t>P(</w:t>
-            </w:r>
-            <w:proofErr w:type="gramEnd"/>
-            <w:r>
-              <w:t xml:space="preserve">Team A beats Team B) and </w:t>
-            </w:r>
-            <w:proofErr w:type="gramStart"/>
-            <w:r>
-              <w:t>P(</w:t>
-            </w:r>
-            <w:proofErr w:type="gramEnd"/>
-            <w:r>
-              <w:t>Team B beats Team A) may not sum to 1 due to how team1/team2 features are ordered; this will be explicitly tested and corrected if violated.</w:t>
+              <w:rPr>
+                <w:b/>
+                <w:bCs/>
+              </w:rPr>
+              <w:t>[Tested]</w:t>
+            </w:r>
+            <w:r>
+              <w:t xml:space="preserve"> Sparse/zero-history teams: contrary to the original hypothesis, sparse-history matches (n=223) showed higher accuracy (93.3%) than established matchups (n=1176, 72.6%) — likely due to clearer skill gaps in mismatched pairings rather than more reliable estimates.</w:t>
             </w:r>
           </w:p>
           <w:p>
@@ -1646,11 +1671,48 @@
               <w:contextualSpacing w:val="0"/>
             </w:pPr>
             <w:r>
-              <w:t xml:space="preserve">winner_*/loser_* columns in the raw dataset are named relative to the actual match outcome and are leakage-prone if used directly; they must be reframed to </w:t>
+              <w:rPr>
+                <w:b/>
+                <w:bCs/>
+              </w:rPr>
+              <w:t>[Tested]</w:t>
+            </w:r>
+            <w:r>
+              <w:t xml:space="preserve"> Prediction symmetry: mean |P(A,B)+P(B,A)−1| = 0.040, max = 0.126 across a 30-pair sample — a small but </w:t>
             </w:r>
             <w:r>
               <w:lastRenderedPageBreak/>
-              <w:t>team1_*/team2_* before training (implemented and verified in 04_model_training.ipynb).</w:t>
+              <w:t>real violation. A symmetry-averaging correction (</w:t>
+            </w:r>
+            <w:proofErr w:type="spellStart"/>
+            <w:r>
+              <w:t>p_final</w:t>
+            </w:r>
+            <w:proofErr w:type="spellEnd"/>
+            <w:r>
+              <w:t xml:space="preserve"> = (</w:t>
+            </w:r>
+            <w:proofErr w:type="spellStart"/>
+            <w:r>
+              <w:t>p_ab</w:t>
+            </w:r>
+            <w:proofErr w:type="spellEnd"/>
+            <w:r>
+              <w:t xml:space="preserve"> + (1-p_ba))/2) is applied at inference time.</w:t>
+            </w:r>
+          </w:p>
+          <w:p>
+            <w:pPr>
+              <w:pStyle w:val="ae"/>
+              <w:numPr>
+                <w:ilvl w:val="0"/>
+                <w:numId w:val="10"/>
+              </w:numPr>
+              <w:spacing w:after="80"/>
+              <w:contextualSpacing w:val="0"/>
+            </w:pPr>
+            <w:r>
+              <w:t>winner_*/loser_* columns in the raw dataset are named relative to the actual match outcome and are leakage-prone if used directly; they must be reframed to team1_*/team2_* before training (implemented and verified in 04_model_training.ipynb).</w:t>
             </w:r>
           </w:p>
           <w:p>
@@ -2245,6 +2307,7 @@
         <w:spacing w:after="80" w:line="240" w:lineRule="auto"/>
       </w:pPr>
       <w:r>
+        <w:lastRenderedPageBreak/>
         <w:t>What is the final, correlation/importance-reduced feature subset (from the ~40 candidate columns)?</w:t>
       </w:r>
     </w:p>
@@ -2282,19 +2345,33 @@
           <w:numId w:val="14"/>
         </w:numPr>
         <w:spacing w:after="80" w:line="240" w:lineRule="auto"/>
+        <w:rPr>
+          <w:strike/>
+        </w:rPr>
       </w:pPr>
       <w:r>
+        <w:rPr>
+          <w:strike/>
+        </w:rPr>
         <w:t>How will probability calibration, prediction symmetry (P(A beats B) vs P(B beats A)), and behavior on new/sparse-history teams be validated — and what corrective steps (e.g. recalibration, averaging symmetric predictions) will be taken if issues are found?</w:t>
       </w:r>
     </w:p>
     <w:p>
       <w:pPr>
+        <w:spacing w:after="80" w:line="240" w:lineRule="auto"/>
+        <w:ind w:left="720"/>
+      </w:pPr>
+      <w:r>
+        <w:t>Resolved — see Section 7 and 05_evaluation.ipynb results above.</w:t>
+      </w:r>
+    </w:p>
+    <w:p>
+      <w:pPr>
         <w:pStyle w:val="1"/>
         <w:keepNext w:val="0"/>
         <w:spacing w:before="0"/>
       </w:pPr>
       <w:r>
-        <w:lastRenderedPageBreak/>
         <w:t>13. Optional Directions</w:t>
       </w:r>
     </w:p>
@@ -2756,7 +2833,7 @@
         <w:rFonts w:hint="default"/>
       </w:rPr>
     </w:lvl>
-    <w:lvl w:ilvl="1" w:tplc="04190019" w:tentative="1">
+    <w:lvl w:ilvl="1" w:tplc="04190019">
       <w:start w:val="1"/>
       <w:numFmt w:val="lowerLetter"/>
       <w:lvlText w:val="%2."/>

</xml_diff>